<commit_message>
W6 materials updated Oct 8th 2026
</commit_message>
<xml_diff>
--- a/homework/hw06/HW06_Assignment.docx
+++ b/homework/hw06/HW06_Assignment.docx
@@ -193,7 +193,22 @@
           <w:sz w:val="22"/>
           <w:szCs w:val="22"/>
         </w:rPr>
-        <w:t xml:space="preserve">What happens to the balance between the terms as the reach gets faster? </w:t>
+        <w:t xml:space="preserve">What happens to the balance between the terms as the reach gets faster? Two of the three torque terms respond to speed very differently, and the ratio between them inverts.</w:t>
+      </w:r>
+    </w:p>
+    <w:p>
+      <w:pPr>
+        <w:spacing w:after="100" w:line="276"/>
+        <w:ind w:left="504" w:hanging="259"/>
+      </w:pPr>
+      <w:r>
+        <w:rPr>
+          <w:rFonts w:ascii="Cambria" w:cs="Cambria" w:eastAsia="Cambria" w:hAnsi="Cambria"/>
+          <w:color w:val="666666"/>
+          <w:sz w:val="22"/>
+          <w:szCs w:val="22"/>
+        </w:rPr>
+        <w:t xml:space="preserve">·  </w:t>
       </w:r>
       <w:r>
         <w:rPr>
@@ -202,23 +217,13 @@
           <w:sz w:val="22"/>
           <w:szCs w:val="22"/>
         </w:rPr>
-        <w:t xml:space="preserve">Two of the three torque terms respond to speed very differently, and the ratio between them inverts.</w:t>
+        <w:t xml:space="preserve">What does the cost exponent actually buy? Crowninshield and Brand argued for the cubic from endurance. You will sweep n from 1 to 5 across the whole workspace and decide what evidence could distinguish the choices.</w:t>
       </w:r>
     </w:p>
     <w:p>
       <w:pPr>
-        <w:spacing w:after="100" w:line="276"/>
-        <w:ind w:left="504" w:hanging="259"/>
-      </w:pPr>
-      <w:r>
-        <w:rPr>
-          <w:rFonts w:ascii="Cambria" w:cs="Cambria" w:eastAsia="Cambria" w:hAnsi="Cambria"/>
-          <w:color w:val="666666"/>
-          <w:sz w:val="22"/>
-          <w:szCs w:val="22"/>
-        </w:rPr>
-        <w:t xml:space="preserve">·  </w:t>
-      </w:r>
+        <w:spacing w:after="140" w:before="0" w:line="276"/>
+      </w:pPr>
       <w:r>
         <w:rPr>
           <w:rFonts w:ascii="Cambria" w:cs="Cambria" w:eastAsia="Cambria" w:hAnsi="Cambria"/>
@@ -226,30 +231,7 @@
           <w:sz w:val="22"/>
           <w:szCs w:val="22"/>
         </w:rPr>
-        <w:t xml:space="preserve">What does the cost exponent actually buy? </w:t>
-      </w:r>
-      <w:r>
-        <w:rPr>
-          <w:rFonts w:ascii="Cambria" w:cs="Cambria" w:eastAsia="Cambria" w:hAnsi="Cambria"/>
-          <w:color w:val="333333"/>
-          <w:sz w:val="22"/>
-          <w:szCs w:val="22"/>
-        </w:rPr>
-        <w:t xml:space="preserve">Crowninshield and Brand argued for the cubic from endurance. You will sweep n from 1 to 5 across the whole workspace and decide what evidence could distinguish the choices.</w:t>
-      </w:r>
-    </w:p>
-    <w:p>
-      <w:pPr>
-        <w:spacing w:after="140" w:before="0" w:line="276"/>
-      </w:pPr>
-      <w:r>
-        <w:rPr>
-          <w:rFonts w:ascii="Cambria" w:cs="Cambria" w:eastAsia="Cambria" w:hAnsi="Cambria"/>
-          <w:color w:val="333333"/>
-          <w:sz w:val="22"/>
-          <w:szCs w:val="22"/>
-        </w:rPr>
-        <w:t xml:space="preserve">Work in newton-metres throughout, and use the corrected force-to-activation chain from Lab 06 Task C.7 — the one that strips the passive spring and the force–velocity multiplier before inverting the force–length relation. Feeding transmitted force straight into the inversion overestimates deltoid activation by about a quarter.</w:t>
+        <w:t xml:space="preserve">Work in newton-meters throughout, and use the corrected force-to-activation chain from Lab 06 Task C.7 — the one that strips the passive spring and the force–velocity multiplier before inverting the force–length relation. Feeding transmitted force straight into the inversion overestimates deltoid activation by about a quarter.</w:t>
       </w:r>
     </w:p>
     <w:p>
@@ -1670,7 +1652,7 @@
                 <w:sz w:val="20"/>
                 <w:szCs w:val="20"/>
               </w:rPr>
-              <w:t xml:space="preserve">Given EMG from all six muscles, describe the measurement you would make to choose between n = 1 and n = 3, and say what result would favour each.</w:t>
+              <w:t xml:space="preserve">Given EMG from all six muscles, describe the measurement you would make to choose between n = 1 and n = 3, and say what result would favor each.</w:t>
             </w:r>
           </w:p>
         </w:tc>
@@ -2179,7 +2161,7 @@
           <w:sz w:val="22"/>
           <w:szCs w:val="22"/>
         </w:rPr>
-        <w:t xml:space="preserve">Unlike labs, AI assistance is permitted on homework. If you use it, disclose it in the final cell: which tool, for what, and what you verified yourself. Undisclosed use is an integrity violation; disclosed use is not penalised.</w:t>
+        <w:t xml:space="preserve">Unlike labs, AI assistance is permitted on homework. If you use it, disclose it in the final cell: which tool, for what, and what you verified yourself. Undisclosed use is an integrity violation; disclosed use is not penalized.</w:t>
       </w:r>
     </w:p>
     <w:p>

</xml_diff>